<commit_message>
docs: fix runaway pagination in defence guide (spurious page breaks)
The generic "blank spacer paragraph" template used when programmatically
assembling the previous revision was accidentally cloned from the one blank
paragraph in the source document that carried a hidden pageBreakBefore (it
was the intentional break pushing the old "STAGE 1" heading onto its own
page). Every inserted blank line inherited that page break, so most new
content -- Stage 1's condensed tables, the new Module 3/4/6 sections, etc --
ended up isolated one block per page (43 pages instead of 22). Re-templated
the blank spacer from a genuinely plain blank paragraph and rebuilt the
document; verified by rendering to PDF that Stage 1 and the rest of the
guide now paginate normally.

Co-Authored-By: Claude Sonnet 5 <noreply@anthropic.com>
</commit_message>
<xml_diff>
--- a/docs/PPFDaaS_Audit_and_Defense_Guide.docx
+++ b/docs/PPFDaaS_Audit_and_Defense_Guide.docx
@@ -218,8 +218,7 @@
     </w:p>
     <w:p>
       <w:pPr>
-        <w:pageBreakBefore/>
-        <w:spacing w:after="0" w:before="0"/>
+        <w:spacing w:after="160" w:before="160"/>
       </w:pPr>
     </w:p>
     <w:p>
@@ -242,8 +241,7 @@
     </w:p>
     <w:p>
       <w:pPr>
-        <w:pageBreakBefore/>
-        <w:spacing w:after="0" w:before="0"/>
+        <w:spacing w:after="160" w:before="160"/>
       </w:pPr>
     </w:p>
     <w:tbl>
@@ -720,8 +718,7 @@
     </w:tbl>
     <w:p>
       <w:pPr>
-        <w:pageBreakBefore/>
-        <w:spacing w:after="0" w:before="0"/>
+        <w:spacing w:after="160" w:before="160"/>
       </w:pPr>
     </w:p>
     <w:tbl>
@@ -1287,8 +1284,7 @@
     </w:tbl>
     <w:p>
       <w:pPr>
-        <w:pageBreakBefore/>
-        <w:spacing w:after="0" w:before="0"/>
+        <w:spacing w:after="160" w:before="160"/>
       </w:pPr>
     </w:p>
     <w:tbl>
@@ -1355,8 +1351,7 @@
     </w:tbl>
     <w:p>
       <w:pPr>
-        <w:pageBreakBefore/>
-        <w:spacing w:after="0" w:before="0"/>
+        <w:spacing w:after="160" w:before="160"/>
       </w:pPr>
     </w:p>
     <w:p>
@@ -2894,8 +2889,7 @@
     </w:tbl>
     <w:p>
       <w:pPr>
-        <w:pageBreakBefore/>
-        <w:spacing w:after="0" w:before="0"/>
+        <w:spacing w:after="160" w:before="160"/>
       </w:pPr>
     </w:p>
     <w:p>
@@ -5371,8 +5365,7 @@
     </w:tbl>
     <w:p>
       <w:pPr>
-        <w:pageBreakBefore/>
-        <w:spacing w:after="0" w:before="0"/>
+        <w:spacing w:after="160" w:before="160"/>
       </w:pPr>
     </w:p>
     <w:p>
@@ -5464,8 +5457,7 @@
     </w:p>
     <w:p>
       <w:pPr>
-        <w:pageBreakBefore/>
-        <w:spacing w:after="0" w:before="0"/>
+        <w:spacing w:after="160" w:before="160"/>
       </w:pPr>
     </w:p>
     <w:tbl>
@@ -5944,8 +5936,7 @@
     </w:tbl>
     <w:p>
       <w:pPr>
-        <w:pageBreakBefore/>
-        <w:spacing w:after="0" w:before="0"/>
+        <w:spacing w:after="160" w:before="160"/>
       </w:pPr>
     </w:p>
     <w:tbl>
@@ -6015,8 +6006,7 @@
     </w:tbl>
     <w:p>
       <w:pPr>
-        <w:pageBreakBefore/>
-        <w:spacing w:after="0" w:before="0"/>
+        <w:spacing w:after="160" w:before="160"/>
       </w:pPr>
     </w:p>
     <w:p>
@@ -6126,8 +6116,7 @@
     </w:p>
     <w:p>
       <w:pPr>
-        <w:pageBreakBefore/>
-        <w:spacing w:after="0" w:before="0"/>
+        <w:spacing w:after="160" w:before="160"/>
       </w:pPr>
     </w:p>
     <w:tbl>
@@ -6650,8 +6639,7 @@
     </w:tbl>
     <w:p>
       <w:pPr>
-        <w:pageBreakBefore/>
-        <w:spacing w:after="0" w:before="0"/>
+        <w:spacing w:after="160" w:before="160"/>
       </w:pPr>
     </w:p>
     <w:tbl>
@@ -6721,8 +6709,7 @@
     </w:tbl>
     <w:p>
       <w:pPr>
-        <w:pageBreakBefore/>
-        <w:spacing w:after="0" w:before="0"/>
+        <w:spacing w:after="160" w:before="160"/>
       </w:pPr>
     </w:p>
     <w:p>
@@ -6814,8 +6801,7 @@
     </w:p>
     <w:p>
       <w:pPr>
-        <w:pageBreakBefore/>
-        <w:spacing w:after="0" w:before="0"/>
+        <w:spacing w:after="160" w:before="160"/>
       </w:pPr>
     </w:p>
     <w:tbl>
@@ -7322,8 +7308,7 @@
     </w:tbl>
     <w:p>
       <w:pPr>
-        <w:pageBreakBefore/>
-        <w:spacing w:after="0" w:before="0"/>
+        <w:spacing w:after="160" w:before="160"/>
       </w:pPr>
     </w:p>
     <w:tbl>
@@ -7393,8 +7378,7 @@
     </w:tbl>
     <w:p>
       <w:pPr>
-        <w:pageBreakBefore/>
-        <w:spacing w:after="0" w:before="0"/>
+        <w:spacing w:after="160" w:before="160"/>
       </w:pPr>
     </w:p>
     <w:p>
@@ -7434,8 +7418,7 @@
     </w:p>
     <w:p>
       <w:pPr>
-        <w:pageBreakBefore/>
-        <w:spacing w:after="0" w:before="0"/>
+        <w:spacing w:after="160" w:before="160"/>
       </w:pPr>
     </w:p>
     <w:p>
@@ -7527,8 +7510,7 @@
     </w:p>
     <w:p>
       <w:pPr>
-        <w:pageBreakBefore/>
-        <w:spacing w:after="0" w:before="0"/>
+        <w:spacing w:after="160" w:before="160"/>
       </w:pPr>
     </w:p>
     <w:tbl>
@@ -7916,8 +7898,7 @@
     </w:tbl>
     <w:p>
       <w:pPr>
-        <w:pageBreakBefore/>
-        <w:spacing w:after="0" w:before="0"/>
+        <w:spacing w:after="160" w:before="160"/>
       </w:pPr>
     </w:p>
     <w:tbl>
@@ -7987,8 +7968,7 @@
     </w:tbl>
     <w:p>
       <w:pPr>
-        <w:pageBreakBefore/>
-        <w:spacing w:after="0" w:before="0"/>
+        <w:spacing w:after="160" w:before="160"/>
       </w:pPr>
     </w:p>
     <w:p>
@@ -8080,8 +8060,7 @@
     </w:p>
     <w:p>
       <w:pPr>
-        <w:pageBreakBefore/>
-        <w:spacing w:after="0" w:before="0"/>
+        <w:spacing w:after="160" w:before="160"/>
       </w:pPr>
     </w:p>
     <w:tbl>
@@ -8558,8 +8537,7 @@
     </w:tbl>
     <w:p>
       <w:pPr>
-        <w:pageBreakBefore/>
-        <w:spacing w:after="0" w:before="0"/>
+        <w:spacing w:after="160" w:before="160"/>
       </w:pPr>
     </w:p>
     <w:tbl>
@@ -8629,8 +8607,7 @@
     </w:tbl>
     <w:p>
       <w:pPr>
-        <w:pageBreakBefore/>
-        <w:spacing w:after="0" w:before="0"/>
+        <w:spacing w:after="160" w:before="160"/>
       </w:pPr>
     </w:p>
     <w:p>
@@ -10053,8 +10030,7 @@
     </w:tbl>
     <w:p>
       <w:pPr>
-        <w:pageBreakBefore/>
-        <w:spacing w:after="0" w:before="0"/>
+        <w:spacing w:after="160" w:before="160"/>
       </w:pPr>
     </w:p>
     <w:tbl>
@@ -10110,8 +10086,7 @@
     </w:tbl>
     <w:p>
       <w:pPr>
-        <w:pageBreakBefore/>
-        <w:spacing w:after="0" w:before="0"/>
+        <w:spacing w:after="160" w:before="160"/>
       </w:pPr>
     </w:p>
     <w:tbl>
@@ -10192,8 +10167,7 @@
     </w:tbl>
     <w:p>
       <w:pPr>
-        <w:pageBreakBefore/>
-        <w:spacing w:after="0" w:before="0"/>
+        <w:spacing w:after="160" w:before="160"/>
       </w:pPr>
     </w:p>
     <w:tbl>
@@ -10274,8 +10248,7 @@
     </w:tbl>
     <w:p>
       <w:pPr>
-        <w:pageBreakBefore/>
-        <w:spacing w:after="0" w:before="0"/>
+        <w:spacing w:after="160" w:before="160"/>
       </w:pPr>
     </w:p>
     <w:p>
@@ -10315,8 +10288,7 @@
     </w:p>
     <w:p>
       <w:pPr>
-        <w:pageBreakBefore/>
-        <w:spacing w:after="0" w:before="0"/>
+        <w:spacing w:after="160" w:before="160"/>
       </w:pPr>
     </w:p>
     <w:tbl>
@@ -10882,8 +10854,7 @@
     </w:tbl>
     <w:p>
       <w:pPr>
-        <w:pageBreakBefore/>
-        <w:spacing w:after="0" w:before="0"/>
+        <w:spacing w:after="160" w:before="160"/>
       </w:pPr>
     </w:p>
     <w:tbl>
@@ -10953,8 +10924,7 @@
     </w:tbl>
     <w:p>
       <w:pPr>
-        <w:pageBreakBefore/>
-        <w:spacing w:after="0" w:before="0"/>
+        <w:spacing w:after="160" w:before="160"/>
       </w:pPr>
     </w:p>
     <w:p>

</xml_diff>